<commit_message>
Link partner recommendations and prepare rubric handoff
</commit_message>
<xml_diff>
--- a/deliverables/539_Mobile_Writeup_Original_Format.docx
+++ b/deliverables/539_Mobile_Writeup_Original_Format.docx
@@ -379,7 +379,7 @@
           <w:szCs w:val="24"/>
           <w:rtl w:val="0"/>
         </w:rPr>
-        <w:t xml:space="preserve">https://skylarsong0107.github.io/client_project_f26/</w:t>
+        <w:t xml:space="preserve">https://skylarsong0107.github.io/client_project_f26/ (The revised version is awaiting final approval and publication.)</w:t>
       </w:r>
       <w:r>
         <w:rPr>
@@ -822,7 +822,7 @@
           <w:color w:val="980000"/>
           <w:rtl w:val="0"/>
         </w:rPr>
-        <w:t xml:space="preserve">The layout adjusts to the screen width. Text and images move into a single column when there is less space. The navigation can wrap onto more rows. Images fit inside their containers, so they do not push the page wider. I also reduced photo sizes to give the text more room. Short sections and lists help students scan the content on a phone.</w:t>
+        <w:t xml:space="preserve">I used CSS Grid to let the layout fit the available space. Content moves into one column on a small screen. Navigation links wrap into rows. The paired photos stay side by side. Each image fits its container. I resized new photos for the web. I did not use width media queries. The only media query supports reduced motion. All four pages fit a 390px screen without horizontal scrolling.</w:t>
       </w:r>
     </w:p>
     <w:p>
@@ -866,8 +866,7 @@
           <w:color w:val="980000"/>
           <w:rtl w:val="0"/>
         </w:rPr>
-        <w:t xml:space="preserve">I used header, nav, main, and footer elements to organize each page. Each page has one main heading. Images have descriptive alt text. A skip link lets keyboard users move directly to the main content. Links have a visible focus style. The navigation also marks the current page.
-The project record includes earlier HTML and axe checks. The latest layout still needs a new WAVE and axe review. I have not added new validation screenshots yet.</w:t>
+        <w:t xml:space="preserve">Each page uses header, nav, main, and footer elements. Each page has one main heading. Photos have descriptive alt text. The skip link appears when it receives keyboard focus. It moves focus to the main content. Links have visible focus outlines. The current navigation link has an underline, a background, and aria-current. The footer focus outline is maize on navy. Reduced-motion preferences turn off smooth scrolling. All four pages passed the W3C HTML check with no messages. Final WAVE and axe checks are still pending. I will add the actual results and screenshots before submission.</w:t>
       </w:r>
     </w:p>
     <w:p>
@@ -916,8 +915,7 @@
           <w:color w:val="980000"/>
           <w:rtl w:val="0"/>
         </w:rPr>
-        <w:t xml:space="preserve">The same navigation appears on every page. The Home page has three stage cards that guide students to the next step. Resource links use clear names. Each resource section explains how the resource can help.
-Since the first deliverable, I added styling, responsive layouts, photos, and clearer content sections. I grouped preparation and project-start guidance into smaller sections. I also changed the campus partner sections into text-and-photo blocks. Each photo is used only once. These changes make the pages easier to scan and reduce repeated content.</w:t>
+        <w:t xml:space="preserve">The same navigation appears on all four pages. The Home page has three cards for the main stages. Resource sections explain when and how to use each resource. The partner comparison lists each type of support beside a direct link to the right organization. Since the first deliverable, I added shared styles, responsive Grid layouts, photos, and clear content sections. Longer guidance points use individual cards. Short lists stay together in text blocks. Each content photo is used once. The first photo group is on the right on desktop. Later photo rows alternate sides. These choices make the information easier to scan.</w:t>
       </w:r>
       <w:r>
         <w:rPr>
@@ -2651,7 +2649,7 @@
           <w:color w:val="980000"/>
           <w:rtl w:val="0"/>
         </w:rPr>
-        <w:t xml:space="preserve">Photo selection, image sizing, and GitHub version control. Hours were not recorded.</w:t>
+        <w:t xml:space="preserve">Photo selection, image resizing, and GitHub version control.</w:t>
       </w:r>
       <w:r>
         <w:rPr>
@@ -2703,7 +2701,7 @@
           <w:szCs w:val="28"/>
           <w:rtl w:val="0"/>
         </w:rPr>
-        <w:t xml:space="preserve">WAVE and axe screenshots for the latest version are still needed. </w:t>
+        <w:t xml:space="preserve">[Add WAVE and axe screenshots for all four pages of the final live site here.] </w:t>
       </w:r>
       <w:r>
         <w:rPr>

</xml_diff>

<commit_message>
Record verified Pages deployment and update submission cost table
</commit_message>
<xml_diff>
--- a/deliverables/539_Mobile_Writeup_Original_Format.docx
+++ b/deliverables/539_Mobile_Writeup_Original_Format.docx
@@ -34,6 +34,9 @@
           <w:rtl w:val="0"/>
         </w:rPr>
         <w:t xml:space="preserve"> </w:t>
+      </w:r>
+      <w:r>
+        <w:t>10.18.2026</w:t>
       </w:r>
     </w:p>
     <w:p>
@@ -329,7 +332,7 @@
           <w:szCs w:val="24"/>
           <w:rtl w:val="0"/>
         </w:rPr>
-        <w:t xml:space="preserve">Title | Name | email address</w:t>
+        <w:t xml:space="preserve">Student contact details are included in the submission copy.</w:t>
       </w:r>
       <w:r>
         <w:rPr>
@@ -379,7 +382,7 @@
           <w:szCs w:val="24"/>
           <w:rtl w:val="0"/>
         </w:rPr>
-        <w:t xml:space="preserve">https://skylarsong0107.github.io/client_project_f26/ (The revised version is awaiting final approval and publication.)</w:t>
+        <w:t xml:space="preserve">https://skylarsong0107.github.io/client_project_f26/</w:t>
       </w:r>
       <w:r>
         <w:rPr>
@@ -415,7 +418,7 @@
           <w:szCs w:val="24"/>
           <w:rtl w:val="0"/>
         </w:rPr>
-        <w:t xml:space="preserve">https://github.com/SkylarSong0107/client_project_f26/tree/codex/mobile-view-refresh-20261018</w:t>
+        <w:t xml:space="preserve">https://github.com/SkylarSong0107/client_project_f26</w:t>
       </w:r>
       <w:r>
         <w:rPr>
@@ -1227,6 +1230,9 @@
                 <w:rtl w:val="0"/>
               </w:rPr>
             </w:r>
+            <w:r>
+              <w:t>1</w:t>
+            </w:r>
           </w:p>
         </w:tc>
         <w:tc>
@@ -1302,6 +1308,9 @@
                 <w:rtl w:val="0"/>
               </w:rPr>
             </w:r>
+            <w:r>
+              <w:t>$110</w:t>
+            </w:r>
           </w:p>
         </w:tc>
       </w:tr>
@@ -1370,6 +1379,9 @@
                 <w:rtl w:val="0"/>
               </w:rPr>
             </w:r>
+            <w:r>
+              <w:t>1</w:t>
+            </w:r>
           </w:p>
         </w:tc>
         <w:tc>
@@ -1445,6 +1457,9 @@
                 <w:rtl w:val="0"/>
               </w:rPr>
             </w:r>
+            <w:r>
+              <w:t>$110</w:t>
+            </w:r>
           </w:p>
         </w:tc>
       </w:tr>
@@ -1513,6 +1528,9 @@
                 <w:rtl w:val="0"/>
               </w:rPr>
             </w:r>
+            <w:r>
+              <w:t>2</w:t>
+            </w:r>
           </w:p>
         </w:tc>
         <w:tc>
@@ -1588,6 +1606,9 @@
                 <w:rtl w:val="0"/>
               </w:rPr>
             </w:r>
+            <w:r>
+              <w:t>$220</w:t>
+            </w:r>
           </w:p>
         </w:tc>
       </w:tr>
@@ -1656,6 +1677,9 @@
                 <w:rtl w:val="0"/>
               </w:rPr>
             </w:r>
+            <w:r>
+              <w:t>2</w:t>
+            </w:r>
           </w:p>
         </w:tc>
         <w:tc>
@@ -1718,6 +1742,9 @@
                 <w:rtl w:val="0"/>
               </w:rPr>
             </w:r>
+            <w:r>
+              <w:t>$220</w:t>
+            </w:r>
           </w:p>
         </w:tc>
       </w:tr>
@@ -1786,6 +1813,9 @@
                 <w:rtl w:val="0"/>
               </w:rPr>
             </w:r>
+            <w:r>
+              <w:t>3</w:t>
+            </w:r>
           </w:p>
         </w:tc>
         <w:tc>
@@ -1848,6 +1878,9 @@
                 <w:rtl w:val="0"/>
               </w:rPr>
             </w:r>
+            <w:r>
+              <w:t>$330</w:t>
+            </w:r>
           </w:p>
         </w:tc>
       </w:tr>
@@ -1929,6 +1962,9 @@
                 <w:rtl w:val="0"/>
               </w:rPr>
             </w:r>
+            <w:r>
+              <w:t>1</w:t>
+            </w:r>
           </w:p>
         </w:tc>
         <w:tc>
@@ -1991,6 +2027,9 @@
                 <w:rtl w:val="0"/>
               </w:rPr>
             </w:r>
+            <w:r>
+              <w:t>$110</w:t>
+            </w:r>
           </w:p>
         </w:tc>
       </w:tr>
@@ -2072,6 +2111,9 @@
                 <w:rtl w:val="0"/>
               </w:rPr>
             </w:r>
+            <w:r>
+              <w:t>1</w:t>
+            </w:r>
           </w:p>
         </w:tc>
         <w:tc>
@@ -2134,6 +2176,9 @@
                 <w:rtl w:val="0"/>
               </w:rPr>
             </w:r>
+            <w:r>
+              <w:t>$110</w:t>
+            </w:r>
           </w:p>
         </w:tc>
       </w:tr>
@@ -2523,6 +2568,9 @@
                 <w:rtl w:val="0"/>
               </w:rPr>
             </w:r>
+            <w:r>
+              <w:t>11</w:t>
+            </w:r>
           </w:p>
         </w:tc>
         <w:tc>
@@ -2596,6 +2644,9 @@
               <w:rPr>
                 <w:rtl w:val="0"/>
               </w:rPr>
+            </w:r>
+            <w:r>
+              <w:t>$1,210</w:t>
             </w:r>
           </w:p>
         </w:tc>

</xml_diff>